<commit_message>
Added Total Monthly budget and expense
</commit_message>
<xml_diff>
--- a/expense-tracker-api.docx
+++ b/expense-tracker-api.docx
@@ -824,34 +824,6 @@
       </w:pPr>
       <w:r>
         <w:rPr>
-          <w:rtl w:val="0"/>
-        </w:rPr>
-      </w:r>
-    </w:p>
-    <w:p>
-      <w:pPr>
-        <w:rPr>
-          <w:rFonts w:ascii="Times New Roman" w:cs="Times New Roman" w:eastAsia="Times New Roman" w:hAnsi="Times New Roman"/>
-          <w:sz w:val="28"/>
-          <w:szCs w:val="28"/>
-        </w:rPr>
-      </w:pPr>
-      <w:r>
-        <w:rPr>
-          <w:rtl w:val="0"/>
-        </w:rPr>
-      </w:r>
-    </w:p>
-    <w:p>
-      <w:pPr>
-        <w:rPr>
-          <w:rFonts w:ascii="Times New Roman" w:cs="Times New Roman" w:eastAsia="Times New Roman" w:hAnsi="Times New Roman"/>
-          <w:sz w:val="28"/>
-          <w:szCs w:val="28"/>
-        </w:rPr>
-      </w:pPr>
-      <w:r>
-        <w:rPr>
           <w:rFonts w:ascii="Times New Roman" w:cs="Times New Roman" w:eastAsia="Times New Roman" w:hAnsi="Times New Roman"/>
           <w:sz w:val="28"/>
           <w:szCs w:val="28"/>
@@ -1660,6 +1632,116 @@
       </w:pPr>
       <w:r>
         <w:rPr>
+          <w:rFonts w:ascii="Times New Roman" w:cs="Times New Roman" w:eastAsia="Times New Roman" w:hAnsi="Times New Roman"/>
+          <w:sz w:val="28"/>
+          <w:szCs w:val="28"/>
+          <w:rtl w:val="0"/>
+        </w:rPr>
+        <w:t xml:space="preserve">Get Total Monthly Budget:</w:t>
+      </w:r>
+    </w:p>
+    <w:p>
+      <w:pPr>
+        <w:rPr>
+          <w:rFonts w:ascii="Times New Roman" w:cs="Times New Roman" w:eastAsia="Times New Roman" w:hAnsi="Times New Roman"/>
+          <w:sz w:val="28"/>
+          <w:szCs w:val="28"/>
+        </w:rPr>
+      </w:pPr>
+      <w:r>
+        <w:rPr>
+          <w:rFonts w:ascii="Times New Roman" w:cs="Times New Roman" w:eastAsia="Times New Roman" w:hAnsi="Times New Roman"/>
+          <w:sz w:val="28"/>
+          <w:szCs w:val="28"/>
+          <w:rtl w:val="0"/>
+        </w:rPr>
+        <w:t xml:space="preserve">Method : GET</w:t>
+      </w:r>
+    </w:p>
+    <w:p>
+      <w:pPr>
+        <w:rPr>
+          <w:rFonts w:ascii="Times New Roman" w:cs="Times New Roman" w:eastAsia="Times New Roman" w:hAnsi="Times New Roman"/>
+          <w:sz w:val="28"/>
+          <w:szCs w:val="28"/>
+        </w:rPr>
+      </w:pPr>
+      <w:r>
+        <w:rPr>
+          <w:rFonts w:ascii="Times New Roman" w:cs="Times New Roman" w:eastAsia="Times New Roman" w:hAnsi="Times New Roman"/>
+          <w:sz w:val="28"/>
+          <w:szCs w:val="28"/>
+          <w:rtl w:val="0"/>
+        </w:rPr>
+        <w:t xml:space="preserve">URL : </w:t>
+      </w:r>
+    </w:p>
+    <w:p>
+      <w:pPr>
+        <w:rPr>
+          <w:rFonts w:ascii="Times New Roman" w:cs="Times New Roman" w:eastAsia="Times New Roman" w:hAnsi="Times New Roman"/>
+          <w:sz w:val="38"/>
+          <w:szCs w:val="38"/>
+        </w:rPr>
+      </w:pPr>
+      <w:r>
+        <w:rPr>
+          <w:rFonts w:ascii="Roboto" w:cs="Roboto" w:eastAsia="Roboto" w:hAnsi="Roboto"/>
+          <w:color w:val="212121"/>
+          <w:sz w:val="28"/>
+          <w:szCs w:val="28"/>
+          <w:rtl w:val="0"/>
+        </w:rPr>
+        <w:t xml:space="preserve">http://localhost:8081/budget/total?month=AUGUST&amp;year=2026</w:t>
+      </w:r>
+      <w:r>
+        <w:rPr>
+          <w:rtl w:val="0"/>
+        </w:rPr>
+      </w:r>
+    </w:p>
+    <w:p>
+      <w:pPr>
+        <w:rPr>
+          <w:rFonts w:ascii="Times New Roman" w:cs="Times New Roman" w:eastAsia="Times New Roman" w:hAnsi="Times New Roman"/>
+          <w:sz w:val="28"/>
+          <w:szCs w:val="28"/>
+        </w:rPr>
+      </w:pPr>
+      <w:r>
+        <w:rPr>
+          <w:rtl w:val="0"/>
+        </w:rPr>
+      </w:r>
+    </w:p>
+    <w:p>
+      <w:pPr>
+        <w:rPr>
+          <w:rFonts w:ascii="Times New Roman" w:cs="Times New Roman" w:eastAsia="Times New Roman" w:hAnsi="Times New Roman"/>
+          <w:sz w:val="28"/>
+          <w:szCs w:val="28"/>
+        </w:rPr>
+      </w:pPr>
+      <w:r>
+        <w:rPr>
+          <w:rFonts w:ascii="Times New Roman" w:cs="Times New Roman" w:eastAsia="Times New Roman" w:hAnsi="Times New Roman"/>
+          <w:sz w:val="28"/>
+          <w:szCs w:val="28"/>
+          <w:rtl w:val="0"/>
+        </w:rPr>
+        <w:t xml:space="preserve">Authentication Required</w:t>
+      </w:r>
+    </w:p>
+    <w:p>
+      <w:pPr>
+        <w:rPr>
+          <w:rFonts w:ascii="Times New Roman" w:cs="Times New Roman" w:eastAsia="Times New Roman" w:hAnsi="Times New Roman"/>
+          <w:sz w:val="28"/>
+          <w:szCs w:val="28"/>
+        </w:rPr>
+      </w:pPr>
+      <w:r>
+        <w:rPr>
           <w:rtl w:val="0"/>
         </w:rPr>
       </w:r>
@@ -2358,20 +2440,6 @@
       </w:pPr>
       <w:r>
         <w:rPr>
-          <w:rtl w:val="0"/>
-        </w:rPr>
-      </w:r>
-    </w:p>
-    <w:p>
-      <w:pPr>
-        <w:rPr>
-          <w:rFonts w:ascii="Times New Roman" w:cs="Times New Roman" w:eastAsia="Times New Roman" w:hAnsi="Times New Roman"/>
-          <w:sz w:val="28"/>
-          <w:szCs w:val="28"/>
-        </w:rPr>
-      </w:pPr>
-      <w:r>
-        <w:rPr>
           <w:rFonts w:ascii="Times New Roman" w:cs="Times New Roman" w:eastAsia="Times New Roman" w:hAnsi="Times New Roman"/>
           <w:sz w:val="28"/>
           <w:szCs w:val="28"/>
@@ -2390,6 +2458,93 @@
       </w:pPr>
       <w:r>
         <w:rPr>
+          <w:rFonts w:ascii="Times New Roman" w:cs="Times New Roman" w:eastAsia="Times New Roman" w:hAnsi="Times New Roman"/>
+          <w:sz w:val="28"/>
+          <w:szCs w:val="28"/>
+          <w:rtl w:val="0"/>
+        </w:rPr>
+        <w:t xml:space="preserve">get total monthly Expense:</w:t>
+      </w:r>
+    </w:p>
+    <w:p>
+      <w:pPr>
+        <w:rPr>
+          <w:rFonts w:ascii="Times New Roman" w:cs="Times New Roman" w:eastAsia="Times New Roman" w:hAnsi="Times New Roman"/>
+          <w:sz w:val="28"/>
+          <w:szCs w:val="28"/>
+        </w:rPr>
+      </w:pPr>
+      <w:r>
+        <w:rPr>
+          <w:rFonts w:ascii="Times New Roman" w:cs="Times New Roman" w:eastAsia="Times New Roman" w:hAnsi="Times New Roman"/>
+          <w:sz w:val="28"/>
+          <w:szCs w:val="28"/>
+          <w:rtl w:val="0"/>
+        </w:rPr>
+        <w:t xml:space="preserve">Method : GET</w:t>
+      </w:r>
+    </w:p>
+    <w:p>
+      <w:pPr>
+        <w:rPr>
+          <w:rFonts w:ascii="Times New Roman" w:cs="Times New Roman" w:eastAsia="Times New Roman" w:hAnsi="Times New Roman"/>
+          <w:sz w:val="38"/>
+          <w:szCs w:val="38"/>
+        </w:rPr>
+      </w:pPr>
+      <w:r>
+        <w:rPr>
+          <w:rFonts w:ascii="Times New Roman" w:cs="Times New Roman" w:eastAsia="Times New Roman" w:hAnsi="Times New Roman"/>
+          <w:sz w:val="28"/>
+          <w:szCs w:val="28"/>
+          <w:rtl w:val="0"/>
+        </w:rPr>
+        <w:t xml:space="preserve">URL : </w:t>
+      </w:r>
+      <w:r>
+        <w:rPr>
+          <w:rFonts w:ascii="Roboto" w:cs="Roboto" w:eastAsia="Roboto" w:hAnsi="Roboto"/>
+          <w:color w:val="212121"/>
+          <w:sz w:val="28"/>
+          <w:szCs w:val="28"/>
+          <w:rtl w:val="0"/>
+        </w:rPr>
+        <w:t xml:space="preserve">http://localhost:8081/transaction/total?month=AUGUST&amp;year=2026</w:t>
+      </w:r>
+      <w:r>
+        <w:rPr>
+          <w:rtl w:val="0"/>
+        </w:rPr>
+      </w:r>
+    </w:p>
+    <w:p>
+      <w:pPr>
+        <w:rPr>
+          <w:rFonts w:ascii="Times New Roman" w:cs="Times New Roman" w:eastAsia="Times New Roman" w:hAnsi="Times New Roman"/>
+          <w:sz w:val="28"/>
+          <w:szCs w:val="28"/>
+        </w:rPr>
+      </w:pPr>
+      <w:r>
+        <w:rPr>
+          <w:rFonts w:ascii="Times New Roman" w:cs="Times New Roman" w:eastAsia="Times New Roman" w:hAnsi="Times New Roman"/>
+          <w:sz w:val="28"/>
+          <w:szCs w:val="28"/>
+          <w:rtl w:val="0"/>
+        </w:rPr>
+        <w:t xml:space="preserve">Authentication Required</w:t>
+      </w:r>
+    </w:p>
+    <w:p>
+      <w:pPr>
+        <w:rPr>
+          <w:rFonts w:ascii="Times New Roman" w:cs="Times New Roman" w:eastAsia="Times New Roman" w:hAnsi="Times New Roman"/>
+          <w:sz w:val="28"/>
+          <w:szCs w:val="28"/>
+        </w:rPr>
+      </w:pPr>
+      <w:r>
+        <w:rPr>
           <w:rtl w:val="0"/>
         </w:rPr>
       </w:r>
@@ -2466,10 +2621,20 @@
       <w:pPr>
         <w:rPr>
           <w:rFonts w:ascii="Times New Roman" w:cs="Times New Roman" w:eastAsia="Times New Roman" w:hAnsi="Times New Roman"/>
-          <w:sz w:val="28"/>
-          <w:szCs w:val="28"/>
-        </w:rPr>
-      </w:pPr>
+          <w:sz w:val="36"/>
+          <w:szCs w:val="36"/>
+        </w:rPr>
+      </w:pPr>
+      <w:r>
+        <w:rPr>
+          <w:rFonts w:ascii="Roboto" w:cs="Roboto" w:eastAsia="Roboto" w:hAnsi="Roboto"/>
+          <w:color w:val="212121"/>
+          <w:sz w:val="26"/>
+          <w:szCs w:val="26"/>
+          <w:rtl w:val="0"/>
+        </w:rPr>
+        <w:t xml:space="preserve">http://localhost:8081/summary?month=AUGUST&amp;year=2026&amp;category=Food</w:t>
+      </w:r>
       <w:r>
         <w:rPr>
           <w:rtl w:val="0"/>
@@ -2492,6 +2657,20 @@
           <w:rtl w:val="0"/>
         </w:rPr>
         <w:t xml:space="preserve">Authentication Required</w:t>
+      </w:r>
+    </w:p>
+    <w:p>
+      <w:pPr>
+        <w:rPr>
+          <w:rFonts w:ascii="Times New Roman" w:cs="Times New Roman" w:eastAsia="Times New Roman" w:hAnsi="Times New Roman"/>
+          <w:sz w:val="28"/>
+          <w:szCs w:val="28"/>
+        </w:rPr>
+      </w:pPr>
+      <w:r>
+        <w:rPr>
+          <w:rtl w:val="0"/>
+        </w:rPr>
       </w:r>
     </w:p>
     <w:p>
@@ -2684,6 +2863,20 @@
       <w:sz w:val="72"/>
       <w:szCs w:val="72"/>
     </w:rPr>
+  </w:style>
+  <w:style w:type="table" w:styleId="TableNormal" w:default="1">
+    <w:name w:val="TableNormal"/>
+    <w:tblPr>
+      <w:tblCellMar>
+        <w:top w:w="100.0" w:type="dxa"/>
+        <w:left w:w="100.0" w:type="dxa"/>
+        <w:bottom w:w="100.0" w:type="dxa"/>
+        <w:right w:w="100.0" w:type="dxa"/>
+      </w:tblCellMar>
+    </w:tblPr>
+  </w:style>
+  <w:style w:type="paragraph" w:styleId="Normal" w:default="1">
+    <w:name w:val="normal"/>
   </w:style>
   <w:style w:type="table" w:styleId="TableNormal" w:default="1">
     <w:name w:val="TableNormal"/>
@@ -3043,7 +3236,7 @@
 
 <file path=customXML/item1.xml><?xml version="1.0" encoding="utf-8"?>
 <go:gDocsCustomXmlDataStorage xmlns:go="http://customooxmlschemas.google.com/" xmlns:r="http://schemas.openxmlformats.org/officeDocument/2006/relationships" uri="GoogleDocsCustomDataVersion2">
-  <go:docsCustomData xmlns:go="http://customooxmlschemas.google.com/" roundtripDataSignature="AMtx7mgZNibMyH8aHBKgTb2HqhUe2dw0Bw==">CgMxLjA4AHIhMTQyb0QtbjktbWk4Ny01RGs0U1pNSllEUnJ0aTlzU2hl</go:docsCustomData>
+  <go:docsCustomData xmlns:go="http://customooxmlschemas.google.com/" roundtripDataSignature="AMtx7miZweW1wFt2lsDW4pyxjKL7WTXh2Q==">CgMxLjA4AHIhMXMxYVRUSzFQWXRsdnJoV0ZpdHdOM213c2JKdkNKWUxs</go:docsCustomData>
 </go:gDocsCustomXmlDataStorage>
 </file>
 

</xml_diff>